<commit_message>
Regenerate submission package from the v2.0.0 pipeline
Refreshes manuscript, SI, cover letters and the bundled ZIP so the
submission_ready/ folder matches the current unified/seeded pipeline.

Co-Authored-By: Claude Sonnet 5 <noreply@anthropic.com>
</commit_message>
<xml_diff>
--- a/manuscript/submission_ready/03_Supporting_Information_KRAS_gC3N4_Monreal_Hernandez_et_al.docx
+++ b/manuscript/submission_ready/03_Supporting_Information_KRAS_gC3N4_Monreal_Hernandez_et_al.docx
@@ -6837,7 +6837,7 @@
               <w:rPr>
                 <w:sz w:val="14"/>
               </w:rPr>
-              <w:t>GLN99</w:t>
+              <w:t>GLY60</w:t>
             </w:r>
           </w:p>
         </w:tc>
@@ -6865,7 +6865,7 @@
               <w:rPr>
                 <w:sz w:val="14"/>
               </w:rPr>
-              <w:t>TYR64</w:t>
+              <w:t>GLN99</w:t>
             </w:r>
           </w:p>
         </w:tc>
@@ -6893,7 +6893,7 @@
               <w:rPr>
                 <w:sz w:val="14"/>
               </w:rPr>
-              <w:t>GLY60</w:t>
+              <w:t>TYR64</w:t>
             </w:r>
           </w:p>
         </w:tc>
@@ -7117,7 +7117,7 @@
               <w:rPr>
                 <w:sz w:val="14"/>
               </w:rPr>
-              <w:t>GLY10</w:t>
+              <w:t>GLU63</w:t>
             </w:r>
           </w:p>
         </w:tc>

</xml_diff>